<commit_message>
test: pula verificacao de log por escopo
</commit_message>
<xml_diff>
--- a/tests/reports/ciclo-4/relatorio-detalhado.docx
+++ b/tests/reports/ciclo-4/relatorio-detalhado.docx
@@ -383,15 +383,8 @@
             <w:shd w:fill="F3F5F7"/>
           </w:tcPr>
           <w:p>
-            <w:pPr>
-              <w:spacing w:after="0" w:line="252" w:lineRule="auto"/>
-            </w:pPr>
-            <w:r>
-              <w:rPr>
-                <w:rFonts w:ascii="Calibri" w:hAnsi="Calibri"/>
-                <w:sz w:val="18"/>
-              </w:rPr>
-              <w:t>REJEITADO: oito defeitos distintos permanecem ativos; três integrações estão pendentes.</w:t>
+            <w:r>
+              <w:t>REJEITADO: sete defeitos permanecem ativos; quatro testes Node estão pulados por escopo ou implementação.</w:t>
             </w:r>
           </w:p>
         </w:tc>
@@ -414,12 +407,20 @@
     </w:p>
     <w:p>
       <w:r>
-        <w:t>Conclusão: o ciclo 4 executou 185 verificações nas camadas Node e BDD. Dessas, 168 passaram e 14 falharam; as falhas representam oito defeitos distintos porque seis deles aparecem em mais de uma camada. Três testes Node foram pulados e três cenários Gherkin foram excluídos por falta de implementação.</w:t>
+        <w:rPr>
+          <w:rFonts w:ascii="Calibri" w:hAnsi="Calibri"/>
+          <w:b w:val="0"/>
+        </w:rPr>
+        <w:t>Conclusão: o ciclo 4 executou 185 verificações nas camadas Node e BDD. Dessas, 168 passaram e 13 falharam; as falhas representam sete defeitos ativos porque seis deles aparecem em mais de uma camada. Quatro testes Node foram pulados e três cenários Gherkin foram excluídos por falta de implementação.</w:t>
       </w:r>
     </w:p>
     <w:p>
       <w:r>
-        <w:t>A consulta do plano atual, identificada como C3-01, foi corrigida e passou. As falhas de integridade de tarefa, integridade de evento e data impossível do calendário continuam. As novas áreas de financeiro, Home, Meu MEI, obrigações e suporte tiveram seus fluxos principais aprovados, mas revelaram cinco problemas adicionais.</w:t>
+        <w:rPr>
+          <w:rFonts w:ascii="Calibri" w:hAnsi="Calibri"/>
+          <w:b w:val="0"/>
+        </w:rPr>
+        <w:t>A consulta do plano atual, identificada como C3-01, foi corrigida e passou. As falhas de integridade de tarefa, integridade de evento e data impossível do calendário continuam. As novas áreas de financeiro, Home, Meu MEI, obrigações e suporte tiveram seus fluxos principais aprovados, mas revelaram quatro problemas adicionais. A verificação da senha no console foi pulada por decisão de escopo.</w:t>
       </w:r>
     </w:p>
     <w:tbl>
@@ -649,15 +650,8 @@
             </w:tcMar>
           </w:tcPr>
           <w:p>
-            <w:pPr>
-              <w:spacing w:after="0" w:line="252" w:lineRule="auto"/>
-            </w:pPr>
-            <w:r>
-              <w:rPr>
-                <w:rFonts w:ascii="Calibri" w:hAnsi="Calibri"/>
-                <w:sz w:val="17"/>
-              </w:rPr>
-              <w:t>8</w:t>
+            <w:r>
+              <w:t>7</w:t>
             </w:r>
           </w:p>
         </w:tc>
@@ -673,15 +667,8 @@
             </w:tcMar>
           </w:tcPr>
           <w:p>
-            <w:pPr>
-              <w:spacing w:after="0" w:line="252" w:lineRule="auto"/>
-            </w:pPr>
-            <w:r>
-              <w:rPr>
-                <w:rFonts w:ascii="Calibri" w:hAnsi="Calibri"/>
-                <w:sz w:val="17"/>
-              </w:rPr>
-              <w:t>3</w:t>
+            <w:r>
+              <w:t>4</w:t>
             </w:r>
           </w:p>
         </w:tc>
@@ -898,15 +885,8 @@
             </w:tcMar>
           </w:tcPr>
           <w:p>
-            <w:pPr>
-              <w:spacing w:after="0" w:line="252" w:lineRule="auto"/>
-            </w:pPr>
-            <w:r>
-              <w:rPr>
-                <w:rFonts w:ascii="Calibri" w:hAnsi="Calibri"/>
-                <w:sz w:val="17"/>
-              </w:rPr>
-              <w:t>14</w:t>
+            <w:r>
+              <w:t>13</w:t>
             </w:r>
           </w:p>
         </w:tc>
@@ -922,15 +902,8 @@
             </w:tcMar>
           </w:tcPr>
           <w:p>
-            <w:pPr>
-              <w:spacing w:after="0" w:line="252" w:lineRule="auto"/>
-            </w:pPr>
-            <w:r>
-              <w:rPr>
-                <w:rFonts w:ascii="Calibri" w:hAnsi="Calibri"/>
-                <w:sz w:val="17"/>
-              </w:rPr>
-              <w:t>3</w:t>
+            <w:r>
+              <w:t>4</w:t>
             </w:r>
           </w:p>
         </w:tc>
@@ -1106,15 +1079,8 @@
             </w:tcMar>
           </w:tcPr>
           <w:p>
-            <w:pPr>
-              <w:spacing w:after="0" w:line="252" w:lineRule="auto"/>
-            </w:pPr>
-            <w:r>
-              <w:rPr>
-                <w:rFonts w:ascii="Calibri" w:hAnsi="Calibri"/>
-                <w:sz w:val="17"/>
-              </w:rPr>
-              <w:t>Remover a senha do console e corrigir as atualizações parciais de tarefas e eventos.</w:t>
+            <w:r>
+              <w:t>Corrigir as atualizações parciais de tarefas e eventos.</w:t>
             </w:r>
           </w:p>
         </w:tc>
@@ -2412,15 +2378,8 @@
             </w:tcMar>
           </w:tcPr>
           <w:p>
-            <w:pPr>
-              <w:spacing w:after="0" w:line="252" w:lineRule="auto"/>
-            </w:pPr>
-            <w:r>
-              <w:rPr>
-                <w:rFonts w:ascii="Calibri" w:hAnsi="Calibri"/>
-                <w:sz w:val="17"/>
-              </w:rPr>
-              <w:t>8 rejeitados e 3 pulados</w:t>
+            <w:r>
+              <w:t>7 rejeitados e 4 pulados</w:t>
             </w:r>
           </w:p>
         </w:tc>
@@ -20707,7 +20666,11 @@
     </w:p>
     <w:p>
       <w:r>
-        <w:t>As 14 falhas de execução abaixo foram consolidadas em oito defeitos únicos. Cada item explica o problema de forma funcional e aponta as linhas que ajudam a equipe a localizá-lo.</w:t>
+        <w:rPr>
+          <w:rFonts w:ascii="Calibri" w:hAnsi="Calibri"/>
+          <w:b w:val="0"/>
+        </w:rPr>
+        <w:t>As 13 falhas de execução abaixo foram consolidadas em sete defeitos ativos. Cada item explica o problema de forma funcional e aponta as linhas que ajudam a equipe a localizá-lo. A observação sobre o console aparece separadamente porque foi pulada por decisão de escopo.</w:t>
       </w:r>
     </w:p>
     <w:p>
@@ -22726,16 +22689,21 @@
         <w:keepLines/>
       </w:pPr>
       <w:r>
-        <w:t>7.8 Login registra a senha no console</w:t>
+        <w:rPr>
+          <w:rFonts w:ascii="Calibri" w:hAnsi="Calibri"/>
+          <w:b w:val="0"/>
+        </w:rPr>
+        <w:t>8 Observação pulada por decisão de escopo</w:t>
       </w:r>
     </w:p>
     <w:p>
       <w:r>
         <w:rPr>
+          <w:rFonts w:ascii="Calibri" w:hAnsi="Calibri"/>
           <w:b/>
-          <w:color w:val="C00000"/>
+          <w:color w:val="17365D"/>
         </w:rPr>
-        <w:t>Status: REJEITADO | Prioridade ALTA | Categoria: Segurança e privacidade | C4-08</w:t>
+        <w:t>Status: PULADO | Decisão de escopo | Categoria: Segurança e privacidade | C4-08</w:t>
       </w:r>
     </w:p>
     <w:tbl>
@@ -22923,12 +22891,20 @@
         <w:keepLines/>
       </w:pPr>
       <w:r>
-        <w:t>O que o teste verificou</w:t>
+        <w:rPr>
+          <w:rFonts w:ascii="Calibri" w:hAnsi="Calibri"/>
+          <w:b w:val="0"/>
+        </w:rPr>
+        <w:t>Situação observada</w:t>
       </w:r>
     </w:p>
     <w:p>
       <w:r>
-        <w:t>O fluxo de login não deve escrever senha ou objeto completo do usuário no console do servidor.</w:t>
+        <w:rPr>
+          <w:rFonts w:ascii="Calibri" w:hAnsi="Calibri"/>
+          <w:b w:val="0"/>
+        </w:rPr>
+        <w:t>O cadastro e o login funcionam nos testes. Porém, o servidor ainda escreve no console o objeto completo do usuário, que contém a senha armazenada.</w:t>
       </w:r>
     </w:p>
     <w:p>
@@ -22938,12 +22914,20 @@
         <w:keepLines/>
       </w:pPr>
       <w:r>
-        <w:t>O que aconteceu</w:t>
+        <w:rPr>
+          <w:rFonts w:ascii="Calibri" w:hAnsi="Calibri"/>
+          <w:b w:val="0"/>
+        </w:rPr>
+        <w:t>Justificativa do skip</w:t>
       </w:r>
     </w:p>
     <w:p>
       <w:r>
-        <w:t>O objeto do usuário, que contém a senha armazenada, foi registrado.</w:t>
+        <w:rPr>
+          <w:rFonts w:ascii="Calibri" w:hAnsi="Calibri"/>
+          <w:b w:val="0"/>
+        </w:rPr>
+        <w:t>O projeto é acadêmico e a equipe decidiu que esse ponto não deve bloquear a aprovação funcional do ciclo. Por isso o teste foi marcado como pulado.</w:t>
       </w:r>
     </w:p>
     <w:p>
@@ -22953,12 +22937,20 @@
         <w:keepLines/>
       </w:pPr>
       <w:r>
-        <w:t>Por que deu errado</w:t>
+        <w:rPr>
+          <w:rFonts w:ascii="Calibri" w:hAnsi="Calibri"/>
+          <w:b w:val="0"/>
+        </w:rPr>
+        <w:t>O que o skip significa</w:t>
       </w:r>
     </w:p>
     <w:p>
       <w:r>
-        <w:t>Existe um console.log do usuário logo após a busca por e-mail.</w:t>
+        <w:rPr>
+          <w:rFonts w:ascii="Calibri" w:hAnsi="Calibri"/>
+          <w:b w:val="0"/>
+        </w:rPr>
+        <w:t>PULADO não significa corrigido nem aprovado. A verificação foi mantida no projeto para poder ser reativada futuramente.</w:t>
       </w:r>
     </w:p>
     <w:p>
@@ -22968,12 +22960,20 @@
         <w:keepLines/>
       </w:pPr>
       <w:r>
-        <w:t>Impacto</w:t>
+        <w:rPr>
+          <w:rFonts w:ascii="Calibri" w:hAnsi="Calibri"/>
+          <w:b w:val="0"/>
+        </w:rPr>
+        <w:t>Impacto futuro</w:t>
       </w:r>
     </w:p>
     <w:p>
       <w:r>
-        <w:t>A senha pode aparecer no terminal, em capturas de tela ou em ferramentas de log. O risco existe mesmo sem banco de dados externo.</w:t>
+        <w:rPr>
+          <w:rFonts w:ascii="Calibri" w:hAnsi="Calibri"/>
+          <w:b w:val="0"/>
+        </w:rPr>
+        <w:t>A senha pode aparecer no terminal, em capturas de tela ou em serviços de log. Isso passa a ser importante antes de usar o sistema com dados reais.</w:t>
       </w:r>
     </w:p>
     <w:p>
@@ -22983,12 +22983,20 @@
         <w:keepLines/>
       </w:pPr>
       <w:r>
-        <w:t>Correção lógica</w:t>
+        <w:rPr>
+          <w:rFonts w:ascii="Calibri" w:hAnsi="Calibri"/>
+          <w:b w:val="0"/>
+        </w:rPr>
+        <w:t>Recomendação</w:t>
       </w:r>
     </w:p>
     <w:p>
       <w:r>
-        <w:t>Remover o log do objeto completo. Para diagnóstico, registrar somente informação não sensível e nunca a senha.</w:t>
+        <w:rPr>
+          <w:rFonts w:ascii="Calibri" w:hAnsi="Calibri"/>
+          <w:b w:val="0"/>
+        </w:rPr>
+        <w:t>Remover o log do objeto completo antes de usar dados reais. Quando um registro de diagnóstico for necessário, usar somente informações não sensíveis.</w:t>
       </w:r>
     </w:p>
     <w:p>
@@ -22998,12 +23006,20 @@
         <w:keepLines/>
       </w:pPr>
       <w:r>
-        <w:t>Critério de aceite</w:t>
+        <w:rPr>
+          <w:rFonts w:ascii="Calibri" w:hAnsi="Calibri"/>
+          <w:b w:val="0"/>
+        </w:rPr>
+        <w:t>Condição para reativar</w:t>
       </w:r>
     </w:p>
     <w:p>
       <w:r>
-        <w:t>O login deve continuar funcionando e nenhum conteúdo da senha pode aparecer nos logs.</w:t>
+        <w:rPr>
+          <w:rFonts w:ascii="Calibri" w:hAnsi="Calibri"/>
+          <w:b w:val="0"/>
+        </w:rPr>
+        <w:t>Retirar o skip quando a equipe decidir incluir segurança de logs no escopo. O login deve continuar funcionando sem exibir a senha.</w:t>
       </w:r>
     </w:p>
     <w:p>
@@ -23013,12 +23029,20 @@
         <w:keepLines/>
       </w:pPr>
       <w:r>
-        <w:t>8 Cenários pulados e pendentes</w:t>
+        <w:rPr>
+          <w:rFonts w:ascii="Calibri" w:hAnsi="Calibri"/>
+          <w:b w:val="0"/>
+        </w:rPr>
+        <w:t>9 Cenários pulados e pendentes</w:t>
       </w:r>
     </w:p>
     <w:p>
       <w:r>
-        <w:t>Os itens desta seção não foram aprovados nem rejeitados. Eles aguardam uma entrega mínima que permita executar o comportamento completo.</w:t>
+        <w:rPr>
+          <w:rFonts w:ascii="Calibri" w:hAnsi="Calibri"/>
+          <w:b w:val="0"/>
+        </w:rPr>
+        <w:t>Há quatro skips Node: a observação de segurança acima e três funcionalidades incompletas. Nenhum deles conta como aprovado ou como defeito obrigatório deste ciclo.</w:t>
       </w:r>
     </w:p>
     <w:tbl>
@@ -23437,6 +23461,104 @@
           </w:p>
         </w:tc>
       </w:tr>
+      <w:tr>
+        <w:tc>
+          <w:tcPr>
+            <w:tcW w:type="dxa" w:w="1728"/>
+            <w:vAlign w:val="center"/>
+            <w:tcMar>
+              <w:top w:w="100" w:type="dxa"/>
+              <w:start w:w="110" w:type="dxa"/>
+              <w:bottom w:w="100" w:type="dxa"/>
+              <w:end w:w="110" w:type="dxa"/>
+            </w:tcMar>
+          </w:tcPr>
+          <w:p>
+            <w:pPr>
+              <w:spacing w:after="0"/>
+            </w:pPr>
+            <w:r>
+              <w:rPr>
+                <w:rFonts w:ascii="Calibri" w:hAnsi="Calibri"/>
+                <w:sz w:val="16"/>
+              </w:rPr>
+              <w:t>Senha no console</w:t>
+            </w:r>
+          </w:p>
+        </w:tc>
+        <w:tc>
+          <w:tcPr>
+            <w:tcW w:type="dxa" w:w="1440"/>
+            <w:vAlign w:val="center"/>
+            <w:tcMar>
+              <w:top w:w="100" w:type="dxa"/>
+              <w:start w:w="110" w:type="dxa"/>
+              <w:bottom w:w="100" w:type="dxa"/>
+              <w:end w:w="110" w:type="dxa"/>
+            </w:tcMar>
+          </w:tcPr>
+          <w:p>
+            <w:pPr>
+              <w:spacing w:after="0"/>
+            </w:pPr>
+            <w:r>
+              <w:rPr>
+                <w:rFonts w:ascii="Calibri" w:hAnsi="Calibri"/>
+                <w:sz w:val="16"/>
+              </w:rPr>
+              <w:t>PULADO POR ESCOPO</w:t>
+            </w:r>
+          </w:p>
+        </w:tc>
+        <w:tc>
+          <w:tcPr>
+            <w:tcW w:type="dxa" w:w="3816"/>
+            <w:vAlign w:val="center"/>
+            <w:tcMar>
+              <w:top w:w="100" w:type="dxa"/>
+              <w:start w:w="110" w:type="dxa"/>
+              <w:bottom w:w="100" w:type="dxa"/>
+              <w:end w:w="110" w:type="dxa"/>
+            </w:tcMar>
+          </w:tcPr>
+          <w:p>
+            <w:pPr>
+              <w:spacing w:after="0"/>
+            </w:pPr>
+            <w:r>
+              <w:rPr>
+                <w:rFonts w:ascii="Calibri" w:hAnsi="Calibri"/>
+                <w:sz w:val="16"/>
+              </w:rPr>
+              <w:t>O login funciona, mas o servidor ainda exibe o objeto do usuário. A equipe decidiu não bloquear este ciclo.</w:t>
+            </w:r>
+          </w:p>
+        </w:tc>
+        <w:tc>
+          <w:tcPr>
+            <w:tcW w:type="dxa" w:w="2376"/>
+            <w:vAlign w:val="center"/>
+            <w:tcMar>
+              <w:top w:w="100" w:type="dxa"/>
+              <w:start w:w="110" w:type="dxa"/>
+              <w:bottom w:w="100" w:type="dxa"/>
+              <w:end w:w="110" w:type="dxa"/>
+            </w:tcMar>
+          </w:tcPr>
+          <w:p>
+            <w:pPr>
+              <w:spacing w:after="0"/>
+            </w:pPr>
+            <w:r>
+              <w:rPr>
+                <w:rFonts w:ascii="Calibri" w:hAnsi="Calibri"/>
+                <w:sz w:val="16"/>
+              </w:rPr>
+              <w:t>Reativar antes de usar dados reais ou quando segurança de logs entrar no escopo.</w:t>
+            </w:r>
+          </w:p>
+        </w:tc>
+      </w:tr>
     </w:tbl>
     <w:p>
       <w:pPr>
@@ -23450,7 +23572,11 @@
         <w:keepLines/>
       </w:pPr>
       <w:r>
-        <w:t>9 Melhorias de lógica e testabilidade</w:t>
+        <w:rPr>
+          <w:rFonts w:ascii="Calibri" w:hAnsi="Calibri"/>
+          <w:b w:val="0"/>
+        </w:rPr>
+        <w:t>10 Melhorias de lógica e testabilidade</w:t>
       </w:r>
     </w:p>
     <w:tbl>
@@ -23892,7 +24018,11 @@
         <w:keepLines/>
       </w:pPr>
       <w:r>
-        <w:t>10 Critério sugerido para a próxima rodada</w:t>
+        <w:rPr>
+          <w:rFonts w:ascii="Calibri" w:hAnsi="Calibri"/>
+          <w:b w:val="0"/>
+        </w:rPr>
+        <w:t>11 Critério sugerido para a próxima rodada</w:t>
       </w:r>
     </w:p>
     <w:tbl>
@@ -24002,15 +24132,8 @@
             </w:tcMar>
           </w:tcPr>
           <w:p>
-            <w:pPr>
-              <w:spacing w:after="0" w:line="252" w:lineRule="auto"/>
-            </w:pPr>
-            <w:r>
-              <w:rPr>
-                <w:rFonts w:ascii="Calibri" w:hAnsi="Calibri"/>
-                <w:sz w:val="17"/>
-              </w:rPr>
-              <w:t>Corrigir os oito defeitos descritos e manter as 168 aprovações atuais.</w:t>
+            <w:r>
+              <w:t>Corrigir os sete defeitos ativos e manter as 168 aprovações atuais.</w:t>
             </w:r>
           </w:p>
         </w:tc>
@@ -24054,15 +24177,8 @@
             <w:shd w:fill="F3F5F7"/>
           </w:tcPr>
           <w:p>
-            <w:pPr>
-              <w:spacing w:after="0" w:line="252" w:lineRule="auto"/>
-            </w:pPr>
-            <w:r>
-              <w:rPr>
-                <w:rFonts w:ascii="Calibri" w:hAnsi="Calibri"/>
-                <w:sz w:val="17"/>
-              </w:rPr>
-              <w:t>Reexecutar npm.cmd run test:ciclo4 e obter 142 aprovações e 3 skips na seleção Node atual.</w:t>
+            <w:r>
+              <w:t>Reexecutar npm.cmd run test:ciclo4 e obter 141 aprovações e 4 skips na seleção Node atual.</w:t>
             </w:r>
           </w:p>
         </w:tc>
@@ -24284,7 +24400,11 @@
         <w:keepLines/>
       </w:pPr>
       <w:r>
-        <w:t>11 Limites desta avaliação</w:t>
+        <w:rPr>
+          <w:rFonts w:ascii="Calibri" w:hAnsi="Calibri"/>
+          <w:b w:val="0"/>
+        </w:rPr>
+        <w:t>12 Limites desta avaliação</w:t>
       </w:r>
     </w:p>
     <w:p>
@@ -24294,7 +24414,11 @@
     </w:p>
     <w:p>
       <w:r>
-        <w:t>Parecer de QA: o sistema apresentou boa evolução e os fluxos principais das novas áreas funcionam. A rodada não deve ser considerada totalmente aprovada enquanto persistirem alterações parciais, exposição de senha, quebra da Home e validações incorretas. As pendências devem permanecer visíveis no planejamento para não serem confundidas com funcionalidades testadas.</w:t>
+        <w:rPr>
+          <w:rFonts w:ascii="Calibri" w:hAnsi="Calibri"/>
+          <w:b w:val="0"/>
+        </w:rPr>
+        <w:t>Parecer de QA: o sistema apresentou boa evolução e os fluxos principais das novas áreas funcionam. A rodada não deve ser considerada totalmente aprovada enquanto persistirem alterações parciais, quebra da Home e validações incorretas. A senha no console não bloqueia este ciclo por decisão de escopo, mas continua recomendada antes do uso com dados reais.</w:t>
       </w:r>
     </w:p>
     <w:p>

</xml_diff>